<commit_message>
Latest update added filesystem and web tool, improved prompts and consolidation engine
</commit_message>
<xml_diff>
--- a/buddy/memory/Memory_Engine_Understanding_Guide.docx
+++ b/buddy/memory/Memory_Engine_Understanding_Guide.docx
@@ -505,7 +505,16 @@
           <w:sz w:val="22"/>
           <w:szCs w:val="22"/>
         </w:rPr>
-        <w:t xml:space="preserve">The engine groups near-duplicate memories into clusters — sets of memories that cover the same topic. Each cluster is then compressed into a single summary memory by an LLM call. The summary replaces the cluster, the way a person remembers the gist of a conversation rather than every individual sentence.</w:t>
+        <w:t>The engine groups related memories into clusters using BFS (breadth-first search) over a similarity graph — not 1-hop seed expansion as in v4.1. BFS finds the same connected component regardless of traversal order.</w:t>
+        <w:br/>
+        <w:br/>
+        <w:t>v5 adds temporal coherence labelling: clusters where all memories were created within 14 days are episodic (a specific event). Clusters spanning more than 14 days are schema (a recurring pattern of knowledge). Different summary styles apply to each.</w:t>
+        <w:br/>
+        <w:br/>
+        <w:t>A depth cap prevents runaway re-summarisation: if a cluster's sources are already depth ≥ 3 summaries, the LLM must return confidence ≥ 0.70 or the re-summarisation is blocked.</w:t>
+        <w:br/>
+        <w:br/>
+        <w:t>Each cluster is compressed into a single summary memory by an LLM call. The summary replaces the cluster, the way a person remembers the gist of a conversation rather than every individual sentence.</w:t>
       </w:r>
     </w:p>
     <w:p>
@@ -968,7 +977,16 @@
           <w:sz w:val="22"/>
           <w:szCs w:val="22"/>
         </w:rPr>
-        <w:t xml:space="preserve">Critical safety rule: </w:t>
+        <w:t>v5 protection rules — any one exempts a memory from all deletion:</w:t>
+        <w:br/>
+        <w:t>• Rule A: importance ≥ 0.80 AND never summarised</w:t>
+        <w:br/>
+        <w:t>• Rule B: importance ≥ 0.70 AND no duplicates (dup_count == 0)  ← broadened in v5</w:t>
+        <w:br/>
+        <w:t>• Rule C: protection_tier is 'critical' or 'immortal'  ← new in v5, LLM-assigned at encoding</w:t>
+        <w:br/>
+        <w:br/>
+        <w:t>v5 also adds a cluster extinction guard (the last surviving member of a cluster can never be pruned) and a forgotten_log audit table (every hard deletion is recorded with id, text, reason, and timestamp). This is the catastrophic forgetting guard.</w:t>
       </w:r>
       <w:r>
         <w:rPr>
@@ -977,7 +995,6 @@
           <w:sz w:val="22"/>
           <w:szCs w:val="22"/>
         </w:rPr>
-        <w:t xml:space="preserve">No memory with an importance score above 0.80 can ever be deleted, regardless of age, access count, or redundancy. This is the catastrophic forgetting guard.</w:t>
       </w:r>
     </w:p>
     <w:p>
@@ -2435,7 +2452,7 @@
           <w:sz w:val="22"/>
           <w:szCs w:val="22"/>
         </w:rPr>
-        <w:t xml:space="preserve">The engine detects emotional arousal through three complementary signals:</w:t>
+        <w:t>The engine detects emotional arousal through three signals measured during sleep scoring, plus a fourth — encoding arousal — captured before the LLM compresses the raw message (new in v5):</w:t>
       </w:r>
     </w:p>
     <w:p>
@@ -2554,6 +2571,35 @@
           <w:szCs w:val="22"/>
         </w:rPr>
         <w:t xml:space="preserve">If Buddy learns 'You had a meeting on Tuesday' (neutral) and 'You told me your mother was diagnosed with cancer today — you were devastated' (high arousal), the second memory will still be significantly stronger six months later even if neither has been accessed since.</w:t>
+      </w:r>
+    </w:p>
+    <w:p>
+      <w:pPr>
+        <w:pStyle w:val="Heading3"/>
+      </w:pPr>
+      <w:r>
+        <w:t>Encoding Arousal — captured before LLM compression (v5 new)</w:t>
+      </w:r>
+    </w:p>
+    <w:p>
+      <w:r>
+        <w:t>In v5, the pipeline measures encoding_arousal from the raw user message before the Brain LLM processes it. The LLM's summarisation compresses emotional nuance — 'I am terrified about tomorrow's surgery' might become 'user has a medical appointment'. The emotional intensity of the original words would be lost. By measuring arousal from the raw text and storing it in metadata['encoding_arousal'], the engine preserves that signal independently of what the LLM kept.</w:t>
+      </w:r>
+    </w:p>
+    <w:p>
+      <w:r>
+        <w:t>The encoding_arousal value (0.0 to 1.0) is used in three places:</w:t>
+        <w:br/>
+        <w:t>(1) Sleep Phase 0b: amplifies consolidation_strength for emotionally charged memories.</w:t>
+        <w:br/>
+        <w:t>(2) Retrieval: contributes 10% weight in the composite score.</w:t>
+        <w:br/>
+        <w:t>(3) Novelty burst: if encoding_arousal ≥ 0.7 at the moment a memory is first stored, the 5 most semantically similar existing memories each receive a +0.03 consolidation_strength boost — priming the surrounding cluster as the new memory arrives.</w:t>
+      </w:r>
+    </w:p>
+    <w:p>
+      <w:r>
+        <w:t>The keyword list covers English ANEW-validated terms plus 24 Hindi/Hinglish high-arousal words: zaruri, bahut important, dil se, kabhi mat bhulna, darr, gussa, khush, takleef, maut, pyaar, nafrat, zindagi, mushkil, please remember this, and others.</w:t>
       </w:r>
     </w:p>
     <w:p>
@@ -13789,6 +13835,97 @@
       </w:pPr>
       <w:r>
         <w:t xml:space="preserve"/>
+      </w:r>
+    </w:p>
+    <w:p>
+      <w:pPr>
+        <w:pStyle w:val="Heading1"/>
+      </w:pPr>
+      <w:r>
+        <w:t>Section 3 — How Recall Changed in v5</w:t>
+      </w:r>
+    </w:p>
+    <w:p>
+      <w:r>
+        <w:t>This section explains the most user-visible change in v5: sleep consolidation now directly influences what Buddy remembers when you talk to it.</w:t>
+      </w:r>
+    </w:p>
+    <w:p>
+      <w:pPr>
+        <w:pStyle w:val="Heading2"/>
+      </w:pPr>
+      <w:r>
+        <w:t>The Problem in v4.1</w:t>
+      </w:r>
+    </w:p>
+    <w:p>
+      <w:r>
+        <w:t>The sleep engine computed consolidation_strength using six signals (BLA, spreading activation, arousal, prediction error, temporal gradient, proactive interference). But after computing it, the engine threw it away. The strength was used only to decide tier promotions and pruning within that one cycle. The next morning, when you asked Buddy something, retrieval used semantic similarity and reranking only — none of the careful scoring from overnight mattered at all.</w:t>
+      </w:r>
+    </w:p>
+    <w:p>
+      <w:pPr>
+        <w:pStyle w:val="Heading2"/>
+      </w:pPr>
+      <w:r>
+        <w:t>The v5 Fix</w:t>
+      </w:r>
+    </w:p>
+    <w:p>
+      <w:r>
+        <w:t>Phase 0b now calls batch_update_consolidation_strength() and writes every computed score to SQLite. From that point on, every search query reads those scores. A memory that has survived many sleep cycles, been accessed repeatedly, and carries emotional weight will have a high consolidation_strength and will rank higher in retrieval — exactly as it should.</w:t>
+      </w:r>
+    </w:p>
+    <w:p>
+      <w:pPr>
+        <w:pStyle w:val="Heading2"/>
+      </w:pPr>
+      <w:r>
+        <w:t>New Retrieval Formula</w:t>
+      </w:r>
+    </w:p>
+    <w:p>
+      <w:r>
+        <w:t>score = semantic_similarity × 0.40</w:t>
+        <w:br/>
+        <w:t xml:space="preserve">      + consolidation_strength × 0.25</w:t>
+        <w:br/>
+        <w:t xml:space="preserve">      + reranker_score × 0.15</w:t>
+        <w:br/>
+        <w:t xml:space="preserve">      + tier_boost × 0.10</w:t>
+        <w:br/>
+        <w:t xml:space="preserve">      + encoding_arousal × 0.10</w:t>
+        <w:br/>
+        <w:br/>
+        <w:t>Tier boosts: long = 1.0, short = 0.6, flash = 0.2.</w:t>
+        <w:br/>
+        <w:t>Recency and access frequency are no longer separate signals — they are folded into consolidation_strength via BLA and dynamic importance decay.</w:t>
+      </w:r>
+    </w:p>
+    <w:p>
+      <w:pPr>
+        <w:pStyle w:val="Heading2"/>
+      </w:pPr>
+      <w:r>
+        <w:t>Spreading Activation at Retrieval</w:t>
+      </w:r>
+    </w:p>
+    <w:p>
+      <w:r>
+        <w:t>After the initial top-k results are retrieved, the top 3 are used as activators. Each activator searches the vector index for its 5 nearest neighbors. Those neighbors are added to the pool with a dampened score: 0.4 × parent_score × neighbor_similarity. This surfaces thematically connected memories that wouldn't rank on their own — like how remembering one part of an event primes recall of related details.</w:t>
+      </w:r>
+    </w:p>
+    <w:p>
+      <w:pPr>
+        <w:pStyle w:val="Heading2"/>
+      </w:pPr>
+      <w:r>
+        <w:t>Touch Reinforcement</w:t>
+      </w:r>
+    </w:p>
+    <w:p>
+      <w:r>
+        <w:t>Every time a memory is used (touched), its consolidation_strength increases by +0.05, capped at 1.0. This is applied in memory and persisted to SQLite immediately. Memories recalled repeatedly become progressively more prominent in future retrieval, consistent with ACT-R's base-level learning principle.</w:t>
       </w:r>
     </w:p>
     <w:p>
@@ -15740,7 +15877,7 @@
           <w:sz w:val="18"/>
           <w:szCs w:val="18"/>
         </w:rPr>
-        <w:t xml:space="preserve">Buddy AI — Memory Engine Understanding Guide  ·  Engine v4.1  ·  Personal Reference</w:t>
+        <w:t>Buddy AI — Memory Engine Understanding Guide  ·  Engine v5  ·  Personal Reference</w:t>
       </w:r>
     </w:p>
     <w:sectPr>

</xml_diff>